<commit_message>
Add submission security and execution evidence
</commit_message>
<xml_diff>
--- a/docs/submission/runway-guard-security-self-assessment.docx
+++ b/docs/submission/runway-guard-security-self-assessment.docx
@@ -20,7 +20,7 @@
           <w:color w:val="5B6DE4"/>
           <w:sz w:val="22"/>
         </w:rPr>
-        <w:t>Topic E  SME Finance Copilot  |  Submission version 1.0</w:t>
+        <w:t>Topic E  SME Finance Copilot  |  Submission version 1.1</w:t>
       </w:r>
     </w:p>
     <w:p>
@@ -57,6 +57,9 @@
         <w:gridCol w:w="3331"/>
       </w:tblGrid>
       <w:tr>
+        <w:trPr>
+          <w:tblHeader w:val="true"/>
+        </w:trPr>
         <w:tc>
           <w:tcPr>
             <w:tcW w:type="dxa" w:w="3331"/>
@@ -97,7 +100,7 @@
                 <w:color w:val="FFFFFF"/>
                 <w:sz w:val="18"/>
               </w:rPr>
-              <w:t>Allowed capability</w:t>
+              <w:t>Implemented capability</w:t>
             </w:r>
           </w:p>
         </w:tc>
@@ -119,12 +122,15 @@
                 <w:color w:val="FFFFFF"/>
                 <w:sz w:val="18"/>
               </w:rPr>
-              <w:t>Control</w:t>
+              <w:t>Enforcement and evidence</w:t>
             </w:r>
           </w:p>
         </w:tc>
       </w:tr>
       <w:tr>
+        <w:trPr>
+          <w:cantSplit/>
+        </w:trPr>
         <w:tc>
           <w:tcPr>
             <w:tcW w:type="dxa" w:w="1440"/>
@@ -147,7 +153,7 @@
         </w:tc>
         <w:tc>
           <w:tcPr>
-            <w:tcW w:type="dxa" w:w="4752"/>
+            <w:tcW w:type="dxa" w:w="4464"/>
             <w:vAlign w:val="center"/>
             <w:tcMar>
               <w:top w:w="100" w:type="dxa"/>
@@ -161,13 +167,13 @@
               <w:rPr>
                 <w:sz w:val="17"/>
               </w:rPr>
-              <w:t>View synthetic dashboard and connector status.</w:t>
+              <w:t>View the synthetic dashboard, connector status and sample data.</w:t>
             </w:r>
           </w:p>
         </w:tc>
         <w:tc>
           <w:tcPr>
-            <w:tcW w:type="dxa" w:w="3240"/>
+            <w:tcW w:type="dxa" w:w="3528"/>
             <w:vAlign w:val="center"/>
             <w:tcMar>
               <w:top w:w="100" w:type="dxa"/>
@@ -181,12 +187,15 @@
               <w:rPr>
                 <w:sz w:val="17"/>
               </w:rPr>
-              <w:t>No credentials or real customer records in the demo.</w:t>
+              <w:t>No authentication claim, production credential or real customer record.</w:t>
             </w:r>
           </w:p>
         </w:tc>
       </w:tr>
       <w:tr>
+        <w:trPr>
+          <w:cantSplit/>
+        </w:trPr>
         <w:tc>
           <w:tcPr>
             <w:tcW w:type="dxa" w:w="1440"/>
@@ -210,7 +219,7 @@
         </w:tc>
         <w:tc>
           <w:tcPr>
-            <w:tcW w:type="dxa" w:w="4752"/>
+            <w:tcW w:type="dxa" w:w="4464"/>
             <w:vAlign w:val="center"/>
             <w:tcMar>
               <w:top w:w="100" w:type="dxa"/>
@@ -225,13 +234,13 @@
               <w:rPr>
                 <w:sz w:val="17"/>
               </w:rPr>
-              <w:t>Read cash position and identify unreconciled transactions.</w:t>
+              <w:t>Read cash position and find transactions requiring review.</w:t>
             </w:r>
           </w:p>
         </w:tc>
         <w:tc>
           <w:tcPr>
-            <w:tcW w:type="dxa" w:w="3240"/>
+            <w:tcW w:type="dxa" w:w="3528"/>
             <w:vAlign w:val="center"/>
             <w:tcMar>
               <w:top w:w="100" w:type="dxa"/>
@@ -246,12 +255,15 @@
               <w:rPr>
                 <w:sz w:val="17"/>
               </w:rPr>
-              <w:t>Read-only server tools.</w:t>
+              <w:t>Read-only get_cash_position and find_unreconciled_transactions tools.</w:t>
             </w:r>
           </w:p>
         </w:tc>
       </w:tr>
       <w:tr>
+        <w:trPr>
+          <w:cantSplit/>
+        </w:trPr>
         <w:tc>
           <w:tcPr>
             <w:tcW w:type="dxa" w:w="1440"/>
@@ -274,7 +286,7 @@
         </w:tc>
         <w:tc>
           <w:tcPr>
-            <w:tcW w:type="dxa" w:w="4752"/>
+            <w:tcW w:type="dxa" w:w="4464"/>
             <w:vAlign w:val="center"/>
             <w:tcMar>
               <w:top w:w="100" w:type="dxa"/>
@@ -288,13 +300,13 @@
               <w:rPr>
                 <w:sz w:val="17"/>
               </w:rPr>
-              <w:t>Draft collection reminder or payment-plan recommendation.</w:t>
+              <w:t>Create a collection draft or simulated payment-date recommendation.</w:t>
             </w:r>
           </w:p>
         </w:tc>
         <w:tc>
           <w:tcPr>
-            <w:tcW w:type="dxa" w:w="3240"/>
+            <w:tcW w:type="dxa" w:w="3528"/>
             <w:vAlign w:val="center"/>
             <w:tcMar>
               <w:top w:w="100" w:type="dxa"/>
@@ -308,12 +320,15 @@
               <w:rPr>
                 <w:sz w:val="17"/>
               </w:rPr>
-              <w:t>Output stays in approval queue.</w:t>
+              <w:t>Draft-only tools return structured previews; delivery and payment authorization remain false.</w:t>
             </w:r>
           </w:p>
         </w:tc>
       </w:tr>
       <w:tr>
+        <w:trPr>
+          <w:cantSplit/>
+        </w:trPr>
         <w:tc>
           <w:tcPr>
             <w:tcW w:type="dxa" w:w="1440"/>
@@ -337,7 +352,7 @@
         </w:tc>
         <w:tc>
           <w:tcPr>
-            <w:tcW w:type="dxa" w:w="4752"/>
+            <w:tcW w:type="dxa" w:w="4464"/>
             <w:vAlign w:val="center"/>
             <w:tcMar>
               <w:top w:w="100" w:type="dxa"/>
@@ -352,13 +367,13 @@
               <w:rPr>
                 <w:sz w:val="17"/>
               </w:rPr>
-              <w:t>Owner schedules a simulated action.</w:t>
+              <w:t>Record an owner decision in the browser-local simulation.</w:t>
             </w:r>
           </w:p>
         </w:tc>
         <w:tc>
           <w:tcPr>
-            <w:tcW w:type="dxa" w:w="3240"/>
+            <w:tcW w:type="dxa" w:w="3528"/>
             <w:vAlign w:val="center"/>
             <w:tcMar>
               <w:top w:w="100" w:type="dxa"/>
@@ -373,12 +388,15 @@
               <w:rPr>
                 <w:sz w:val="17"/>
               </w:rPr>
-              <w:t>Explicit UI confirmation and trace.</w:t>
+              <w:t>Explicit Confirm/Cancel control and audit entry; no external effect.</w:t>
             </w:r>
           </w:p>
         </w:tc>
       </w:tr>
       <w:tr>
+        <w:trPr>
+          <w:cantSplit/>
+        </w:trPr>
         <w:tc>
           <w:tcPr>
             <w:tcW w:type="dxa" w:w="1440"/>
@@ -401,7 +419,7 @@
         </w:tc>
         <w:tc>
           <w:tcPr>
-            <w:tcW w:type="dxa" w:w="4752"/>
+            <w:tcW w:type="dxa" w:w="4464"/>
             <w:vAlign w:val="center"/>
             <w:tcMar>
               <w:top w:w="100" w:type="dxa"/>
@@ -415,13 +433,13 @@
               <w:rPr>
                 <w:sz w:val="17"/>
               </w:rPr>
-              <w:t>No production execution capability in this prototype.</w:t>
+              <w:t>Not implemented.</w:t>
             </w:r>
           </w:p>
         </w:tc>
         <w:tc>
           <w:tcPr>
-            <w:tcW w:type="dxa" w:w="3240"/>
+            <w:tcW w:type="dxa" w:w="3528"/>
             <w:vAlign w:val="center"/>
             <w:tcMar>
               <w:top w:w="100" w:type="dxa"/>
@@ -435,13 +453,18 @@
               <w:rPr>
                 <w:sz w:val="17"/>
               </w:rPr>
-              <w:t>Payment, messaging and ledger-write tools are absent.</w:t>
+              <w:t>No payment, messaging, bank-detail or ledger-write tool exists in the allowlist.</w:t>
             </w:r>
           </w:p>
         </w:tc>
       </w:tr>
     </w:tbl>
     <w:p/>
+    <w:p>
+      <w:r>
+        <w:br w:type="page"/>
+      </w:r>
+    </w:p>
     <w:p>
       <w:pPr>
         <w:pStyle w:val="Heading1"/>
@@ -463,6 +486,9 @@
         <w:gridCol w:w="3331"/>
       </w:tblGrid>
       <w:tr>
+        <w:trPr>
+          <w:tblHeader w:val="true"/>
+        </w:trPr>
         <w:tc>
           <w:tcPr>
             <w:tcW w:type="dxa" w:w="3331"/>
@@ -531,6 +557,9 @@
         </w:tc>
       </w:tr>
       <w:tr>
+        <w:trPr>
+          <w:cantSplit/>
+        </w:trPr>
         <w:tc>
           <w:tcPr>
             <w:tcW w:type="dxa" w:w="2016"/>
@@ -593,6 +622,9 @@
         </w:tc>
       </w:tr>
       <w:tr>
+        <w:trPr>
+          <w:cantSplit/>
+        </w:trPr>
         <w:tc>
           <w:tcPr>
             <w:tcW w:type="dxa" w:w="2016"/>
@@ -631,7 +663,7 @@
               <w:rPr>
                 <w:sz w:val="17"/>
               </w:rPr>
-              <w:t>Agent receives a fixed allowlist: cash position, reconciliation review, collection draft and security review.</w:t>
+              <w:t>Agent receives a fixed allowlist for analysis, review, drafting, simulated scheduling and security review.</w:t>
             </w:r>
           </w:p>
         </w:tc>
@@ -652,12 +684,15 @@
               <w:rPr>
                 <w:sz w:val="17"/>
               </w:rPr>
-              <w:t>Server rejects unknown tool names.</w:t>
+              <w:t>Server rejects unknown tool names; TC-07 verifies routing and blocking.</w:t>
             </w:r>
           </w:p>
         </w:tc>
       </w:tr>
       <w:tr>
+        <w:trPr>
+          <w:cantSplit/>
+        </w:trPr>
         <w:tc>
           <w:tcPr>
             <w:tcW w:type="dxa" w:w="2016"/>
@@ -720,6 +755,9 @@
         </w:tc>
       </w:tr>
       <w:tr>
+        <w:trPr>
+          <w:cantSplit/>
+        </w:trPr>
         <w:tc>
           <w:tcPr>
             <w:tcW w:type="dxa" w:w="2016"/>
@@ -785,6 +823,9 @@
         </w:tc>
       </w:tr>
       <w:tr>
+        <w:trPr>
+          <w:cantSplit/>
+        </w:trPr>
         <w:tc>
           <w:tcPr>
             <w:tcW w:type="dxa" w:w="2016"/>
@@ -821,7 +862,7 @@
               <w:rPr>
                 <w:sz w:val="17"/>
               </w:rPr>
-              <w:t>Agent tool calls and sandbox events return structured, exportable evidence.</w:t>
+              <w:t>Agent tool calls, policy decisions and sandbox events return structured, exportable evidence.</w:t>
             </w:r>
           </w:p>
         </w:tc>
@@ -841,12 +882,15 @@
               <w:rPr>
                 <w:sz w:val="17"/>
               </w:rPr>
-              <w:t>Audit view and JSON evidence export.</w:t>
+              <w:t>Audit view plus docs/submission/evidence JSON files.</w:t>
             </w:r>
           </w:p>
         </w:tc>
       </w:tr>
       <w:tr>
+        <w:trPr>
+          <w:cantSplit/>
+        </w:trPr>
         <w:tc>
           <w:tcPr>
             <w:tcW w:type="dxa" w:w="2016"/>
@@ -934,6 +978,9 @@
         <w:gridCol w:w="3331"/>
       </w:tblGrid>
       <w:tr>
+        <w:trPr>
+          <w:tblHeader w:val="true"/>
+        </w:trPr>
         <w:tc>
           <w:tcPr>
             <w:tcW w:type="dxa" w:w="3331"/>
@@ -1002,6 +1049,9 @@
         </w:tc>
       </w:tr>
       <w:tr>
+        <w:trPr>
+          <w:cantSplit/>
+        </w:trPr>
         <w:tc>
           <w:tcPr>
             <w:tcW w:type="dxa" w:w="3312"/>
@@ -1064,6 +1114,9 @@
         </w:tc>
       </w:tr>
       <w:tr>
+        <w:trPr>
+          <w:cantSplit/>
+        </w:trPr>
         <w:tc>
           <w:tcPr>
             <w:tcW w:type="dxa" w:w="3312"/>
@@ -1129,6 +1182,9 @@
         </w:tc>
       </w:tr>
       <w:tr>
+        <w:trPr>
+          <w:cantSplit/>
+        </w:trPr>
         <w:tc>
           <w:tcPr>
             <w:tcW w:type="dxa" w:w="3312"/>
@@ -1191,6 +1247,9 @@
         </w:tc>
       </w:tr>
       <w:tr>
+        <w:trPr>
+          <w:cantSplit/>
+        </w:trPr>
         <w:tc>
           <w:tcPr>
             <w:tcW w:type="dxa" w:w="3312"/>
@@ -1256,6 +1315,9 @@
         </w:tc>
       </w:tr>
       <w:tr>
+        <w:trPr>
+          <w:cantSplit/>
+        </w:trPr>
         <w:tc>
           <w:tcPr>
             <w:tcW w:type="dxa" w:w="3312"/>
@@ -1292,7 +1354,7 @@
               <w:rPr>
                 <w:sz w:val="17"/>
               </w:rPr>
-              <w:t>Simulate read-only connection checks; no live credential or payment.</w:t>
+              <w:t>Generate three provider-scoped events for both Alipay and WeChat Pay; no live credential or payment.</w:t>
             </w:r>
           </w:p>
         </w:tc>
@@ -1320,6 +1382,11 @@
     </w:tbl>
     <w:p/>
     <w:p>
+      <w:r>
+        <w:br w:type="page"/>
+      </w:r>
+    </w:p>
+    <w:p>
       <w:pPr>
         <w:pStyle w:val="Heading1"/>
       </w:pPr>
@@ -1340,6 +1407,9 @@
         <w:gridCol w:w="3331"/>
       </w:tblGrid>
       <w:tr>
+        <w:trPr>
+          <w:tblHeader w:val="true"/>
+        </w:trPr>
         <w:tc>
           <w:tcPr>
             <w:tcW w:type="dxa" w:w="3331"/>
@@ -1408,6 +1478,9 @@
         </w:tc>
       </w:tr>
       <w:tr>
+        <w:trPr>
+          <w:cantSplit/>
+        </w:trPr>
         <w:tc>
           <w:tcPr>
             <w:tcW w:type="dxa" w:w="2592"/>
@@ -1470,6 +1543,9 @@
         </w:tc>
       </w:tr>
       <w:tr>
+        <w:trPr>
+          <w:cantSplit/>
+        </w:trPr>
         <w:tc>
           <w:tcPr>
             <w:tcW w:type="dxa" w:w="2592"/>
@@ -1508,7 +1584,7 @@
               <w:rPr>
                 <w:sz w:val="17"/>
               </w:rPr>
-              <w:t>Export evidence immediately for submission.</w:t>
+              <w:t>The evidence command exports timestamped JSON immediately.</w:t>
             </w:r>
           </w:p>
         </w:tc>
@@ -1535,6 +1611,9 @@
         </w:tc>
       </w:tr>
       <w:tr>
+        <w:trPr>
+          <w:cantSplit/>
+        </w:trPr>
         <w:tc>
           <w:tcPr>
             <w:tcW w:type="dxa" w:w="2592"/>
@@ -1545,6 +1624,72 @@
               <w:bottom w:w="100" w:type="dxa"/>
               <w:end w:w="120" w:type="dxa"/>
             </w:tcMar>
+          </w:tcPr>
+          <w:p>
+            <w:r>
+              <w:rPr>
+                <w:sz w:val="17"/>
+              </w:rPr>
+              <w:t>Browser-local state is not multi-user storage</w:t>
+            </w:r>
+          </w:p>
+        </w:tc>
+        <w:tc>
+          <w:tcPr>
+            <w:tcW w:type="dxa" w:w="3096"/>
+            <w:vAlign w:val="center"/>
+            <w:tcMar>
+              <w:top w:w="100" w:type="dxa"/>
+              <w:start w:w="120" w:type="dxa"/>
+              <w:bottom w:w="100" w:type="dxa"/>
+              <w:end w:w="120" w:type="dxa"/>
+            </w:tcMar>
+          </w:tcPr>
+          <w:p>
+            <w:r>
+              <w:rPr>
+                <w:sz w:val="17"/>
+              </w:rPr>
+              <w:t>Only synthetic demo data is permitted and the UI states the boundary.</w:t>
+            </w:r>
+          </w:p>
+        </w:tc>
+        <w:tc>
+          <w:tcPr>
+            <w:tcW w:type="dxa" w:w="3744"/>
+            <w:vAlign w:val="center"/>
+            <w:tcMar>
+              <w:top w:w="100" w:type="dxa"/>
+              <w:start w:w="120" w:type="dxa"/>
+              <w:bottom w:w="100" w:type="dxa"/>
+              <w:end w:w="120" w:type="dxa"/>
+            </w:tcMar>
+          </w:tcPr>
+          <w:p>
+            <w:r>
+              <w:rPr>
+                <w:sz w:val="17"/>
+              </w:rPr>
+              <w:t>Add authenticated server persistence, tenant isolation, backup and retention controls.</w:t>
+            </w:r>
+          </w:p>
+        </w:tc>
+      </w:tr>
+      <w:tr>
+        <w:trPr>
+          <w:cantSplit/>
+        </w:trPr>
+        <w:tc>
+          <w:tcPr>
+            <w:tcW w:type="dxa" w:w="2592"/>
+            <w:vAlign w:val="center"/>
+            <w:tcMar>
+              <w:top w:w="100" w:type="dxa"/>
+              <w:start w:w="120" w:type="dxa"/>
+              <w:bottom w:w="100" w:type="dxa"/>
+              <w:end w:w="120" w:type="dxa"/>
+            </w:tcMar>
+            <w:shd w:fill="F4F7FC"/>
           </w:tcPr>
           <w:p>
             <w:r>
@@ -1565,6 +1710,7 @@
               <w:bottom w:w="100" w:type="dxa"/>
               <w:end w:w="120" w:type="dxa"/>
             </w:tcMar>
+            <w:shd w:fill="F4F7FC"/>
           </w:tcPr>
           <w:p>
             <w:r>
@@ -1585,6 +1731,7 @@
               <w:bottom w:w="100" w:type="dxa"/>
               <w:end w:w="120" w:type="dxa"/>
             </w:tcMar>
+            <w:shd w:fill="F4F7FC"/>
           </w:tcPr>
           <w:p>
             <w:r>
@@ -1597,6 +1744,9 @@
         </w:tc>
       </w:tr>
       <w:tr>
+        <w:trPr>
+          <w:cantSplit/>
+        </w:trPr>
         <w:tc>
           <w:tcPr>
             <w:tcW w:type="dxa" w:w="2592"/>
@@ -1607,7 +1757,6 @@
               <w:bottom w:w="100" w:type="dxa"/>
               <w:end w:w="120" w:type="dxa"/>
             </w:tcMar>
-            <w:shd w:fill="F4F7FC"/>
           </w:tcPr>
           <w:p>
             <w:r>
@@ -1628,7 +1777,6 @@
               <w:bottom w:w="100" w:type="dxa"/>
               <w:end w:w="120" w:type="dxa"/>
             </w:tcMar>
-            <w:shd w:fill="F4F7FC"/>
           </w:tcPr>
           <w:p>
             <w:r>
@@ -1649,7 +1797,6 @@
               <w:bottom w:w="100" w:type="dxa"/>
               <w:end w:w="120" w:type="dxa"/>
             </w:tcMar>
-            <w:shd w:fill="F4F7FC"/>
           </w:tcPr>
           <w:p>
             <w:r>
@@ -1662,6 +1809,9 @@
         </w:tc>
       </w:tr>
       <w:tr>
+        <w:trPr>
+          <w:cantSplit/>
+        </w:trPr>
         <w:tc>
           <w:tcPr>
             <w:tcW w:type="dxa" w:w="2592"/>
@@ -1672,6 +1822,7 @@
               <w:bottom w:w="100" w:type="dxa"/>
               <w:end w:w="120" w:type="dxa"/>
             </w:tcMar>
+            <w:shd w:fill="F4F7FC"/>
           </w:tcPr>
           <w:p>
             <w:r>
@@ -1692,6 +1843,7 @@
               <w:bottom w:w="100" w:type="dxa"/>
               <w:end w:w="120" w:type="dxa"/>
             </w:tcMar>
+            <w:shd w:fill="F4F7FC"/>
           </w:tcPr>
           <w:p>
             <w:r>
@@ -1712,6 +1864,7 @@
               <w:bottom w:w="100" w:type="dxa"/>
               <w:end w:w="120" w:type="dxa"/>
             </w:tcMar>
+            <w:shd w:fill="F4F7FC"/>
           </w:tcPr>
           <w:p>
             <w:r>
@@ -1759,7 +1912,7 @@
         <w:pStyle w:val="ListBullet"/>
       </w:pPr>
       <w:r>
-        <w:t>Exported sandbox evidence JSON for Alipay and WeChat Pay simulated profiles.</w:t>
+        <w:t>sandbox-operation-log.json with six passed Alipay and WeChat Pay simulated events.</w:t>
       </w:r>
     </w:p>
     <w:p>
@@ -1767,7 +1920,15 @@
         <w:pStyle w:val="ListBullet"/>
       </w:pPr>
       <w:r>
-        <w:t>Evaluation output showing four passed control scenarios.</w:t>
+        <w:t>control-evaluation.json showing four of four passed scenarios and one blocked unsafe request.</w:t>
+      </w:r>
+    </w:p>
+    <w:p>
+      <w:pPr>
+        <w:pStyle w:val="ListBullet"/>
+      </w:pPr>
+      <w:r>
+        <w:t>test-results.txt showing ten automated test cases passed.</w:t>
       </w:r>
     </w:p>
     <w:p>
@@ -1793,12 +1954,9 @@
 <w:hdr xmlns:m="http://schemas.openxmlformats.org/officeDocument/2006/math" xmlns:mc="http://schemas.openxmlformats.org/markup-compatibility/2006" xmlns:mo="http://schemas.microsoft.com/office/mac/office/2008/main" xmlns:mv="urn:schemas-microsoft-com:mac:vml" xmlns:o="urn:schemas-microsoft-com:office:office" xmlns:r="http://schemas.openxmlformats.org/officeDocument/2006/relationships" xmlns:v="urn:schemas-microsoft-com:vml" xmlns:w10="urn:schemas-microsoft-com:office:word" xmlns:w14="http://schemas.microsoft.com/office/word/2010/wordml" xmlns:w="http://schemas.openxmlformats.org/wordprocessingml/2006/main" xmlns:wne="http://schemas.microsoft.com/office/word/2006/wordml" xmlns:wp14="http://schemas.microsoft.com/office/word/2010/wordprocessingDrawing" xmlns:wp="http://schemas.openxmlformats.org/drawingml/2006/wordprocessingDrawing" xmlns:wpc="http://schemas.microsoft.com/office/word/2010/wordprocessingCanvas" xmlns:wpg="http://schemas.microsoft.com/office/word/2010/wordprocessingGroup" xmlns:wpi="http://schemas.microsoft.com/office/word/2010/wordprocessingInk" xmlns:wps="http://schemas.microsoft.com/office/word/2010/wordprocessingShape" mc:Ignorable="w14 wp14">
   <w:p>
     <w:pPr>
-      <w:pStyle w:val="Caption"/>
-      <w:jc w:val="right"/>
-    </w:pPr>
-    <w:r>
-      <w:t>RUNWAY GUARD  |  FINTECHATHON INTERNATIONAL TRACK  |  TOPIC E</w:t>
-    </w:r>
+      <w:pStyle w:val="Header"/>
+    </w:pPr>
+    <w:r/>
   </w:p>
 </w:hdr>
 </file>
@@ -2236,7 +2394,7 @@
       <w:rFonts w:asciiTheme="majorHAnsi" w:eastAsiaTheme="majorEastAsia" w:hAnsiTheme="majorHAnsi" w:cstheme="majorBidi" w:ascii="Aptos Display" w:hAnsi="Aptos Display"/>
       <w:b/>
       <w:bCs/>
-      <w:color w:val="183054"/>
+      <w:color w:val="000000"/>
       <w:sz w:val="32"/>
       <w:szCs w:val="28"/>
     </w:rPr>
@@ -2260,7 +2418,7 @@
       <w:rFonts w:asciiTheme="majorHAnsi" w:eastAsiaTheme="majorEastAsia" w:hAnsiTheme="majorHAnsi" w:cstheme="majorBidi" w:ascii="Aptos Display" w:hAnsi="Aptos Display"/>
       <w:b/>
       <w:bCs/>
-      <w:color w:val="183054"/>
+      <w:color w:val="000000"/>
       <w:sz w:val="24"/>
       <w:szCs w:val="26"/>
     </w:rPr>
@@ -2524,7 +2682,7 @@
     <w:rPr>
       <w:rFonts w:asciiTheme="majorHAnsi" w:eastAsiaTheme="majorEastAsia" w:hAnsiTheme="majorHAnsi" w:cstheme="majorBidi" w:ascii="Aptos Display" w:hAnsi="Aptos Display"/>
       <w:b/>
-      <w:color w:val="183054"/>
+      <w:color w:val="000000"/>
       <w:spacing w:val="5"/>
       <w:kern w:val="28"/>
       <w:sz w:val="50"/>

</xml_diff>